<commit_message>
Forecast: remove the optional Chronos path; the built-in engine does the numbers
Co-Authored-By: Claude Opus 5.5 <noreply@anthropic.com>
Claude-Session: https://claude.ai/code/session_01Abejwmu5HVvJbRECFzdmJ1
</commit_message>
<xml_diff>
--- a/docs/category-desk-and-product-ai.docx
+++ b/docs/category-desk-and-product-ai.docx
@@ -2767,25 +2767,6 @@
           <w:szCs w:val="21"/>
         </w:rPr>
         <w:t xml:space="preserve">Every run is saved with who ran it, when and the model, and scored against what actually sold as each month ends: the error and how many months landed in the range. An accuracy report across all products exports to Excel.</w:t>
-      </w:r>
-    </w:p>
-    <w:p>
-      <w:pPr>
-        <w:pStyle w:val="ListParagraph"/>
-        <w:numPr>
-          <w:ilvl w:val="0"/>
-          <w:numId w:val="2"/>
-        </w:numPr>
-        <w:spacing w:after="60" w:line="264"/>
-      </w:pPr>
-      <w:r>
-        <w:rPr>
-          <w:rFonts w:ascii="Arial" w:cs="Arial" w:eastAsia="Arial" w:hAnsi="Arial"/>
-          <w:color w:val="141C2B"/>
-          <w:sz w:val="21"/>
-          <w:szCs w:val="21"/>
-        </w:rPr>
-        <w:t xml:space="preserve">Optional: Chronos on Bedrock Marketplace for the numbers (Forecast:ChronosEndpointArn). It bills by the hour while its endpoint runs, so it stays off unless the accuracy report shows it is needed.</w:t>
       </w:r>
     </w:p>
     <w:p>

</xml_diff>

<commit_message>
Release notes; AI category suggestions dropped (rule suggestions stay)
Co-Authored-By: Claude Opus 5.5 <noreply@anthropic.com>
Claude-Session: https://claude.ai/code/session_01Abejwmu5HVvJbRECFzdmJ1
</commit_message>
<xml_diff>
--- a/docs/category-desk-and-product-ai.docx
+++ b/docs/category-desk-and-product-ai.docx
@@ -1743,7 +1743,7 @@
                 <w:sz w:val="19"/>
                 <w:szCs w:val="19"/>
               </w:rPr>
-              <w:t xml:space="preserve">Name match (next package, with AI suggestions)</w:t>
+              <w:t xml:space="preserve">Nothing else matched: its EGRP category</w:t>
             </w:r>
           </w:p>
         </w:tc>
@@ -1757,101 +1757,6 @@
               <w:right w:val="single" w:color="DDE1E7" w:sz="4"/>
             </w:tcBorders>
             <w:shd w:fill="F7F8FA" w:color="auto" w:val="clear"/>
-            <w:tcMar>
-              <w:top w:type="dxa" w:w="70"/>
-              <w:left w:type="dxa" w:w="110"/>
-              <w:bottom w:type="dxa" w:w="70"/>
-              <w:right w:type="dxa" w:w="110"/>
-            </w:tcMar>
-          </w:tcPr>
-          <w:p>
-            <w:pPr>
-              <w:spacing w:after="30" w:line="252"/>
-            </w:pPr>
-            <w:r>
-              <w:rPr>
-                <w:rFonts w:ascii="Arial" w:cs="Arial" w:eastAsia="Arial" w:hAnsi="Arial"/>
-                <w:color w:val="141C2B"/>
-                <w:sz w:val="19"/>
-                <w:szCs w:val="19"/>
-              </w:rPr>
-              <w:t xml:space="preserve">—</w:t>
-            </w:r>
-          </w:p>
-        </w:tc>
-      </w:tr>
-      <w:tr>
-        <w:tc>
-          <w:tcPr>
-            <w:tcW w:type="dxa" w:w="600"/>
-            <w:tcBorders>
-              <w:top w:val="single" w:color="DDE1E7" w:sz="4"/>
-              <w:left w:val="single" w:color="DDE1E7" w:sz="4"/>
-              <w:bottom w:val="single" w:color="DDE1E7" w:sz="4"/>
-              <w:right w:val="single" w:color="DDE1E7" w:sz="4"/>
-            </w:tcBorders>
-            <w:tcMar>
-              <w:top w:type="dxa" w:w="70"/>
-              <w:left w:type="dxa" w:w="110"/>
-              <w:bottom w:type="dxa" w:w="70"/>
-              <w:right w:type="dxa" w:w="110"/>
-            </w:tcMar>
-          </w:tcPr>
-          <w:p>
-            <w:pPr>
-              <w:spacing w:after="30" w:line="252"/>
-            </w:pPr>
-            <w:r>
-              <w:rPr>
-                <w:rFonts w:ascii="Arial" w:cs="Arial" w:eastAsia="Arial" w:hAnsi="Arial"/>
-                <w:color w:val="141C2B"/>
-                <w:sz w:val="19"/>
-                <w:szCs w:val="19"/>
-              </w:rPr>
-              <w:t xml:space="preserve">5</w:t>
-            </w:r>
-          </w:p>
-        </w:tc>
-        <w:tc>
-          <w:tcPr>
-            <w:tcW w:type="dxa" w:w="4080"/>
-            <w:tcBorders>
-              <w:top w:val="single" w:color="DDE1E7" w:sz="4"/>
-              <w:left w:val="single" w:color="DDE1E7" w:sz="4"/>
-              <w:bottom w:val="single" w:color="DDE1E7" w:sz="4"/>
-              <w:right w:val="single" w:color="DDE1E7" w:sz="4"/>
-            </w:tcBorders>
-            <w:tcMar>
-              <w:top w:type="dxa" w:w="70"/>
-              <w:left w:type="dxa" w:w="110"/>
-              <w:bottom w:type="dxa" w:w="70"/>
-              <w:right w:type="dxa" w:w="110"/>
-            </w:tcMar>
-          </w:tcPr>
-          <w:p>
-            <w:pPr>
-              <w:spacing w:after="30" w:line="252"/>
-            </w:pPr>
-            <w:r>
-              <w:rPr>
-                <w:rFonts w:ascii="Arial" w:cs="Arial" w:eastAsia="Arial" w:hAnsi="Arial"/>
-                <w:color w:val="141C2B"/>
-                <w:sz w:val="19"/>
-                <w:szCs w:val="19"/>
-              </w:rPr>
-              <w:t xml:space="preserve">Nothing else matched: its EGRP category</w:t>
-            </w:r>
-          </w:p>
-        </w:tc>
-        <w:tc>
-          <w:tcPr>
-            <w:tcW w:type="dxa" w:w="4680"/>
-            <w:tcBorders>
-              <w:top w:val="single" w:color="DDE1E7" w:sz="4"/>
-              <w:left w:val="single" w:color="DDE1E7" w:sz="4"/>
-              <w:bottom w:val="single" w:color="DDE1E7" w:sz="4"/>
-              <w:right w:val="single" w:color="DDE1E7" w:sz="4"/>
-            </w:tcBorders>
             <w:tcMar>
               <w:top w:type="dxa" w:w="70"/>
               <w:left w:type="dxa" w:w="110"/>
@@ -2160,7 +2065,7 @@
                 <w:sz w:val="19"/>
                 <w:szCs w:val="19"/>
               </w:rPr>
-              <w:t xml:space="preserve">AI.MarketResearch, AI.Translate, AI.CategorySuggest, AI.ProductLookup, AI.CompetitorPricing, AI.Forecast, granted in Security Admin. Always enforced.</w:t>
+              <w:t xml:space="preserve">AI.MarketResearch, AI.Translate, AI.Forecast, AI.ProductLookup, AI.CompetitorPricing, granted in Security Admin. Always enforced.</w:t>
             </w:r>
           </w:p>
         </w:tc>
@@ -3035,7 +2940,7 @@
                 <w:sz w:val="19"/>
                 <w:szCs w:val="19"/>
               </w:rPr>
-              <w:t xml:space="preserve">AI category suggestions</w:t>
+              <w:t xml:space="preserve">Product lookup</w:t>
             </w:r>
           </w:p>
         </w:tc>
@@ -3066,7 +2971,7 @@
                 <w:sz w:val="19"/>
                 <w:szCs w:val="19"/>
               </w:rPr>
-              <w:t xml:space="preserve">Claude on Bedrock</w:t>
+              <w:t xml:space="preserve">Perplexity + Claude</w:t>
             </w:r>
           </w:p>
         </w:tc>
@@ -3097,7 +3002,7 @@
                 <w:sz w:val="19"/>
                 <w:szCs w:val="19"/>
               </w:rPr>
-              <w:t xml:space="preserve">Picks only categories inside the product's EGRP branch; Uncategorized and Suspect queues</w:t>
+              <w:t xml:space="preserve">Description, images (manufacturer and vendor sources, copied to S3), UPC with source. UPC is Computyme's until cutover</w:t>
             </w:r>
           </w:p>
         </w:tc>
@@ -3131,7 +3036,7 @@
                 <w:sz w:val="19"/>
                 <w:szCs w:val="19"/>
               </w:rPr>
-              <w:t xml:space="preserve">Product lookup</w:t>
+              <w:t xml:space="preserve">Competitor pricing</w:t>
             </w:r>
           </w:p>
         </w:tc>
@@ -3163,7 +3068,7 @@
                 <w:sz w:val="19"/>
                 <w:szCs w:val="19"/>
               </w:rPr>
-              <w:t xml:space="preserve">Perplexity + Claude</w:t>
+              <w:t xml:space="preserve">DataForSEO Google Shopping</w:t>
             </w:r>
           </w:p>
         </w:tc>
@@ -3177,101 +3082,6 @@
               <w:right w:val="single" w:color="DDE1E7" w:sz="4"/>
             </w:tcBorders>
             <w:shd w:fill="F7F8FA" w:color="auto" w:val="clear"/>
-            <w:tcMar>
-              <w:top w:type="dxa" w:w="70"/>
-              <w:left w:type="dxa" w:w="110"/>
-              <w:bottom w:type="dxa" w:w="70"/>
-              <w:right w:type="dxa" w:w="110"/>
-            </w:tcMar>
-          </w:tcPr>
-          <w:p>
-            <w:pPr>
-              <w:spacing w:after="30" w:line="252"/>
-            </w:pPr>
-            <w:r>
-              <w:rPr>
-                <w:rFonts w:ascii="Arial" w:cs="Arial" w:eastAsia="Arial" w:hAnsi="Arial"/>
-                <w:color w:val="141C2B"/>
-                <w:sz w:val="19"/>
-                <w:szCs w:val="19"/>
-              </w:rPr>
-              <w:t xml:space="preserve">Description, images (manufacturer and vendor sources, copied to S3), UPC with source. UPC is Computyme's until cutover</w:t>
-            </w:r>
-          </w:p>
-        </w:tc>
-      </w:tr>
-      <w:tr>
-        <w:tc>
-          <w:tcPr>
-            <w:tcW w:type="dxa" w:w="2200"/>
-            <w:tcBorders>
-              <w:top w:val="single" w:color="DDE1E7" w:sz="4"/>
-              <w:left w:val="single" w:color="DDE1E7" w:sz="4"/>
-              <w:bottom w:val="single" w:color="DDE1E7" w:sz="4"/>
-              <w:right w:val="single" w:color="DDE1E7" w:sz="4"/>
-            </w:tcBorders>
-            <w:tcMar>
-              <w:top w:type="dxa" w:w="70"/>
-              <w:left w:type="dxa" w:w="110"/>
-              <w:bottom w:type="dxa" w:w="70"/>
-              <w:right w:type="dxa" w:w="110"/>
-            </w:tcMar>
-          </w:tcPr>
-          <w:p>
-            <w:pPr>
-              <w:spacing w:after="30" w:line="252"/>
-            </w:pPr>
-            <w:r>
-              <w:rPr>
-                <w:rFonts w:ascii="Arial" w:cs="Arial" w:eastAsia="Arial" w:hAnsi="Arial"/>
-                <w:color w:val="141C2B"/>
-                <w:sz w:val="19"/>
-                <w:szCs w:val="19"/>
-              </w:rPr>
-              <w:t xml:space="preserve">Competitor pricing</w:t>
-            </w:r>
-          </w:p>
-        </w:tc>
-        <w:tc>
-          <w:tcPr>
-            <w:tcW w:type="dxa" w:w="2600"/>
-            <w:tcBorders>
-              <w:top w:val="single" w:color="DDE1E7" w:sz="4"/>
-              <w:left w:val="single" w:color="DDE1E7" w:sz="4"/>
-              <w:bottom w:val="single" w:color="DDE1E7" w:sz="4"/>
-              <w:right w:val="single" w:color="DDE1E7" w:sz="4"/>
-            </w:tcBorders>
-            <w:tcMar>
-              <w:top w:type="dxa" w:w="70"/>
-              <w:left w:type="dxa" w:w="110"/>
-              <w:bottom w:type="dxa" w:w="70"/>
-              <w:right w:type="dxa" w:w="110"/>
-            </w:tcMar>
-          </w:tcPr>
-          <w:p>
-            <w:pPr>
-              <w:spacing w:after="30" w:line="252"/>
-            </w:pPr>
-            <w:r>
-              <w:rPr>
-                <w:rFonts w:ascii="Arial" w:cs="Arial" w:eastAsia="Arial" w:hAnsi="Arial"/>
-                <w:color w:val="141C2B"/>
-                <w:sz w:val="19"/>
-                <w:szCs w:val="19"/>
-              </w:rPr>
-              <w:t xml:space="preserve">DataForSEO Google Shopping</w:t>
-            </w:r>
-          </w:p>
-        </w:tc>
-        <w:tc>
-          <w:tcPr>
-            <w:tcW w:type="dxa" w:w="4560"/>
-            <w:tcBorders>
-              <w:top w:val="single" w:color="DDE1E7" w:sz="4"/>
-              <w:left w:val="single" w:color="DDE1E7" w:sz="4"/>
-              <w:bottom w:val="single" w:color="DDE1E7" w:sz="4"/>
-              <w:right w:val="single" w:color="DDE1E7" w:sz="4"/>
-            </w:tcBorders>
             <w:tcMar>
               <w:top w:type="dxa" w:w="70"/>
               <w:left w:type="dxa" w:w="110"/>
@@ -5062,7 +4872,7 @@
                 <w:sz w:val="19"/>
                 <w:szCs w:val="19"/>
               </w:rPr>
-              <w:t xml:space="preserve">AI.CategorySuggest, AI.ProductLookup, AI.CompetitorPricing</w:t>
+              <w:t xml:space="preserve">AI.ProductLookup, AI.CompetitorPricing</w:t>
             </w:r>
           </w:p>
         </w:tc>

</xml_diff>